<commit_message>
Fix GitHub username in contact line (httptony)
Co-Authored-By: Claude Opus 5.5 <noreply@anthropic.com>
Claude-Session: https://claude.ai/code/session_018BWGoTGSkFcNvafbB5t5Cp
</commit_message>
<xml_diff>
--- a/Tony_Tshandu_Resume.docx
+++ b/Tony_Tshandu_Resume.docx
@@ -74,7 +74,7 @@
         </w:rPr>
         <w:t xml:space="preserve">  •  </w:t>
       </w:r>
-      <w:hyperlink w:history="1" r:id="rIdw8mwmxngftagil9o1449u">
+      <w:hyperlink w:history="1" r:id="rIdeco7ungwtllhzsw-2u7xq">
         <w:r>
           <w:rPr>
             <w:rFonts w:ascii="Calibri" w:cs="Calibri" w:eastAsia="Calibri" w:hAnsi="Calibri"/>
@@ -94,7 +94,7 @@
         </w:rPr>
         <w:t xml:space="preserve">  •  </w:t>
       </w:r>
-      <w:hyperlink w:history="1" r:id="rIdomgu9cmrnckfhikx_rmyi">
+      <w:hyperlink w:history="1" r:id="rId-xpww7dqrcjngwkefyhkz">
         <w:r>
           <w:rPr>
             <w:rFonts w:ascii="Calibri" w:cs="Calibri" w:eastAsia="Calibri" w:hAnsi="Calibri"/>
@@ -114,7 +114,7 @@
         </w:rPr>
         <w:t xml:space="preserve">  •  </w:t>
       </w:r>
-      <w:hyperlink w:history="1" r:id="rIdnresoygbnlitkao-vu-xd">
+      <w:hyperlink w:history="1" r:id="rIdquqa8dpzgzlzv_clp-pow">
         <w:r>
           <w:rPr>
             <w:rFonts w:ascii="Calibri" w:cs="Calibri" w:eastAsia="Calibri" w:hAnsi="Calibri"/>
@@ -122,7 +122,7 @@
             <w:sz w:val="18"/>
             <w:szCs w:val="18"/>
           </w:rPr>
-          <w:t xml:space="preserve">github.com/httpstony</w:t>
+          <w:t xml:space="preserve">github.com/httptony</w:t>
         </w:r>
       </w:hyperlink>
     </w:p>

</xml_diff>

<commit_message>
Add Maidar Secure work, Arcon PAM training and access skills
Co-Authored-By: Claude Opus 5.5 <noreply@anthropic.com>
Claude-Session: https://claude.ai/code/session_012KuDx6upapvKHKqHWPqrA8
</commit_message>
<xml_diff>
--- a/Tony_Tshandu_Resume.docx
+++ b/Tony_Tshandu_Resume.docx
@@ -74,7 +74,7 @@
         </w:rPr>
         <w:t xml:space="preserve">  •  </w:t>
       </w:r>
-      <w:hyperlink w:history="1" r:id="rIdeco7ungwtllhzsw-2u7xq">
+      <w:hyperlink w:history="1" r:id="rIdbr6lktquyrtfadrsf5ke4">
         <w:r>
           <w:rPr>
             <w:rFonts w:ascii="Calibri" w:cs="Calibri" w:eastAsia="Calibri" w:hAnsi="Calibri"/>
@@ -94,7 +94,7 @@
         </w:rPr>
         <w:t xml:space="preserve">  •  </w:t>
       </w:r>
-      <w:hyperlink w:history="1" r:id="rId-xpww7dqrcjngwkefyhkz">
+      <w:hyperlink w:history="1" r:id="rIdtzf-hotipy7t7llcy0ogk">
         <w:r>
           <w:rPr>
             <w:rFonts w:ascii="Calibri" w:cs="Calibri" w:eastAsia="Calibri" w:hAnsi="Calibri"/>
@@ -114,7 +114,7 @@
         </w:rPr>
         <w:t xml:space="preserve">  •  </w:t>
       </w:r>
-      <w:hyperlink w:history="1" r:id="rIdquqa8dpzgzlzv_clp-pow">
+      <w:hyperlink w:history="1" r:id="rIddcgqwh86qlhwimgsfe8ab">
         <w:r>
           <w:rPr>
             <w:rFonts w:ascii="Calibri" w:cs="Calibri" w:eastAsia="Calibri" w:hAnsi="Calibri"/>
@@ -132,7 +132,7 @@
         <w:pBdr>
           <w:bottom w:val="single" w:color="2B7A78" w:sz="8" w:space="3"/>
         </w:pBdr>
-        <w:spacing w:after="60" w:before="130"/>
+        <w:spacing w:after="50" w:before="110"/>
       </w:pPr>
       <w:r>
         <w:rPr>
@@ -166,7 +166,7 @@
         <w:pBdr>
           <w:bottom w:val="single" w:color="2B7A78" w:sz="8" w:space="3"/>
         </w:pBdr>
-        <w:spacing w:after="60" w:before="130"/>
+        <w:spacing w:after="50" w:before="110"/>
       </w:pPr>
       <w:r>
         <w:rPr>
@@ -233,61 +233,6 @@
           <w:szCs w:val="20"/>
         </w:rPr>
         <w:t xml:space="preserve">Oct 2026 - Present</w:t>
-      </w:r>
-    </w:p>
-    <w:p>
-      <w:pPr>
-        <w:keepNext/>
-        <w:spacing w:after="25" w:before="90"/>
-      </w:pPr>
-      <w:r>
-        <w:rPr>
-          <w:rFonts w:ascii="Calibri" w:cs="Calibri" w:eastAsia="Calibri" w:hAnsi="Calibri"/>
-          <w:b/>
-          <w:bCs/>
-          <w:color w:val="1A1A1A"/>
-          <w:sz w:val="20"/>
-          <w:szCs w:val="20"/>
-        </w:rPr>
-        <w:t xml:space="preserve">Cyber1 Solutions</w:t>
-      </w:r>
-      <w:r>
-        <w:rPr>
-          <w:rFonts w:ascii="Calibri" w:cs="Calibri" w:eastAsia="Calibri" w:hAnsi="Calibri"/>
-          <w:color w:val="1A1A1A"/>
-          <w:sz w:val="20"/>
-          <w:szCs w:val="20"/>
-        </w:rPr>
-        <w:t xml:space="preserve">  |  </w:t>
-      </w:r>
-      <w:r>
-        <w:rPr>
-          <w:rFonts w:ascii="Calibri" w:cs="Calibri" w:eastAsia="Calibri" w:hAnsi="Calibri"/>
-          <w:i/>
-          <w:iCs/>
-          <w:color w:val="1A1A1A"/>
-          <w:sz w:val="20"/>
-          <w:szCs w:val="20"/>
-        </w:rPr>
-        <w:t xml:space="preserve">Cybersecurity Engineer Intern</w:t>
-      </w:r>
-      <w:r>
-        <w:rPr>
-          <w:rFonts w:ascii="Calibri" w:cs="Calibri" w:eastAsia="Calibri" w:hAnsi="Calibri"/>
-          <w:color w:val="1A1A1A"/>
-          <w:sz w:val="20"/>
-          <w:szCs w:val="20"/>
-        </w:rPr>
-        <w:t xml:space="preserve">  </w:t>
-      </w:r>
-      <w:r>
-        <w:rPr>
-          <w:rFonts w:ascii="Calibri" w:cs="Calibri" w:eastAsia="Calibri" w:hAnsi="Calibri"/>
-          <w:color w:val="2B7A78"/>
-          <w:sz w:val="20"/>
-          <w:szCs w:val="20"/>
-        </w:rPr>
-        <w:t xml:space="preserve">Jun 2026 - Oct 2026</w:t>
       </w:r>
     </w:p>
     <w:p>
@@ -306,7 +251,62 @@
           <w:sz w:val="20"/>
           <w:szCs w:val="20"/>
         </w:rPr>
-        <w:t xml:space="preserve">Built an SLA tracking pipeline in Devo SOAR (LogicHub) for a major South African bank, timing every Zoho Desk ticket against notify, escalate, respond and resolve targets.</w:t>
+        <w:t xml:space="preserve">Fixed the failing Zoho MCP server in Strike48 and reorganised Devo user permissions and privileges to match each role.</w:t>
+      </w:r>
+    </w:p>
+    <w:p>
+      <w:pPr>
+        <w:keepNext/>
+        <w:spacing w:after="25" w:before="70"/>
+      </w:pPr>
+      <w:r>
+        <w:rPr>
+          <w:rFonts w:ascii="Calibri" w:cs="Calibri" w:eastAsia="Calibri" w:hAnsi="Calibri"/>
+          <w:b/>
+          <w:bCs/>
+          <w:color w:val="1A1A1A"/>
+          <w:sz w:val="20"/>
+          <w:szCs w:val="20"/>
+        </w:rPr>
+        <w:t xml:space="preserve">Cyber1 Solutions</w:t>
+      </w:r>
+      <w:r>
+        <w:rPr>
+          <w:rFonts w:ascii="Calibri" w:cs="Calibri" w:eastAsia="Calibri" w:hAnsi="Calibri"/>
+          <w:color w:val="1A1A1A"/>
+          <w:sz w:val="20"/>
+          <w:szCs w:val="20"/>
+        </w:rPr>
+        <w:t xml:space="preserve">  |  </w:t>
+      </w:r>
+      <w:r>
+        <w:rPr>
+          <w:rFonts w:ascii="Calibri" w:cs="Calibri" w:eastAsia="Calibri" w:hAnsi="Calibri"/>
+          <w:i/>
+          <w:iCs/>
+          <w:color w:val="1A1A1A"/>
+          <w:sz w:val="20"/>
+          <w:szCs w:val="20"/>
+        </w:rPr>
+        <w:t xml:space="preserve">Cybersecurity Engineer Intern</w:t>
+      </w:r>
+      <w:r>
+        <w:rPr>
+          <w:rFonts w:ascii="Calibri" w:cs="Calibri" w:eastAsia="Calibri" w:hAnsi="Calibri"/>
+          <w:color w:val="1A1A1A"/>
+          <w:sz w:val="20"/>
+          <w:szCs w:val="20"/>
+        </w:rPr>
+        <w:t xml:space="preserve">  </w:t>
+      </w:r>
+      <w:r>
+        <w:rPr>
+          <w:rFonts w:ascii="Calibri" w:cs="Calibri" w:eastAsia="Calibri" w:hAnsi="Calibri"/>
+          <w:color w:val="2B7A78"/>
+          <w:sz w:val="20"/>
+          <w:szCs w:val="20"/>
+        </w:rPr>
+        <w:t xml:space="preserve">Jun 2026 - Oct 2026</w:t>
       </w:r>
     </w:p>
     <w:p>
@@ -325,7 +325,7 @@
           <w:sz w:val="20"/>
           <w:szCs w:val="20"/>
         </w:rPr>
-        <w:t xml:space="preserve">Wrote the logic in Python and SQL: ticket state tracking, severity-based breach windows and a 44-field data model.</w:t>
+        <w:t xml:space="preserve">Built an SLA tracking pipeline in Devo SOAR (LogicHub) for a major South African bank, timing every Zoho Desk ticket against notify, escalate, respond and resolve targets.</w:t>
       </w:r>
     </w:p>
     <w:p>
@@ -344,7 +344,7 @@
           <w:sz w:val="20"/>
           <w:szCs w:val="20"/>
         </w:rPr>
-        <w:t xml:space="preserve">Limited the live playbook to open tickets to avoid timeouts, keeping the breach dashboard refreshed every 3 minutes.</w:t>
+        <w:t xml:space="preserve">Wrote the logic in Python and SQL (state tracking, severity-based breach windows, 44-field data model) and scoped it to open tickets so the breach dashboard refreshes every 3 minutes.</w:t>
       </w:r>
     </w:p>
     <w:p>
@@ -426,7 +426,7 @@
     <w:p>
       <w:pPr>
         <w:keepNext/>
-        <w:spacing w:after="25" w:before="90"/>
+        <w:spacing w:after="25" w:before="70"/>
       </w:pPr>
       <w:r>
         <w:rPr>
@@ -537,7 +537,7 @@
     </w:p>
     <w:p>
       <w:pPr>
-        <w:spacing w:after="0" w:before="90"/>
+        <w:spacing w:after="0" w:before="70"/>
       </w:pPr>
       <w:r>
         <w:rPr>
@@ -557,7 +557,7 @@
           <w:sz w:val="20"/>
           <w:szCs w:val="20"/>
         </w:rPr>
-        <w:t xml:space="preserve">Solutions Specialist, Solotek Power Africa (2021-2022) · Showroom Manager, I'm Healthy (2022) · Sports Coach, Bryanston High School (2020) · Brand Promoter &amp; Events Coordinator, independent contractor (2019)</w:t>
+        <w:t xml:space="preserve">Solutions Specialist, Solotek Power Africa (2021-2022) · Showroom Manager, I'm Healthy (2022)</w:t>
       </w:r>
     </w:p>
     <w:p>
@@ -566,7 +566,7 @@
         <w:pBdr>
           <w:bottom w:val="single" w:color="2B7A78" w:sz="8" w:space="3"/>
         </w:pBdr>
-        <w:spacing w:after="60" w:before="130"/>
+        <w:spacing w:after="50" w:before="110"/>
       </w:pPr>
       <w:r>
         <w:rPr>
@@ -664,7 +664,7 @@
         <w:pBdr>
           <w:bottom w:val="single" w:color="2B7A78" w:sz="8" w:space="3"/>
         </w:pBdr>
-        <w:spacing w:after="60" w:before="130"/>
+        <w:spacing w:after="50" w:before="110"/>
       </w:pPr>
       <w:r>
         <w:rPr>
@@ -826,7 +826,7 @@
         <w:pBdr>
           <w:bottom w:val="single" w:color="2B7A78" w:sz="8" w:space="3"/>
         </w:pBdr>
-        <w:spacing w:after="60" w:before="130"/>
+        <w:spacing w:after="50" w:before="110"/>
       </w:pPr>
       <w:r>
         <w:rPr>
@@ -982,6 +982,42 @@
           <w:szCs w:val="20"/>
         </w:rPr>
         <w:t xml:space="preserve">In progress, expected 2027</w:t>
+      </w:r>
+    </w:p>
+    <w:p>
+      <w:pPr>
+        <w:spacing w:after="20" w:before="0"/>
+      </w:pPr>
+      <w:r>
+        <w:rPr>
+          <w:rFonts w:ascii="Calibri" w:cs="Calibri" w:eastAsia="Calibri" w:hAnsi="Calibri"/>
+          <w:b/>
+          <w:bCs/>
+          <w:color w:val="1A1A1A"/>
+          <w:sz w:val="20"/>
+          <w:szCs w:val="20"/>
+        </w:rPr>
+        <w:t xml:space="preserve">Arcon Privileged Access Management (PAM) Training, 2 days</w:t>
+      </w:r>
+      <w:r>
+        <w:rPr>
+          <w:rFonts w:ascii="Calibri" w:cs="Calibri" w:eastAsia="Calibri" w:hAnsi="Calibri"/>
+          <w:color w:val="1A1A1A"/>
+          <w:sz w:val="20"/>
+          <w:szCs w:val="20"/>
+        </w:rPr>
+        <w:t xml:space="preserve">  </w:t>
+      </w:r>
+      <w:r>
+        <w:rPr>
+          <w:rFonts w:ascii="Calibri" w:cs="Calibri" w:eastAsia="Calibri" w:hAnsi="Calibri"/>
+          <w:i/>
+          <w:iCs/>
+          <w:color w:val="2B7A78"/>
+          <w:sz w:val="20"/>
+          <w:szCs w:val="20"/>
+        </w:rPr>
+        <w:t xml:space="preserve">Completed</w:t>
       </w:r>
     </w:p>
     <w:p>
@@ -1062,7 +1098,7 @@
         <w:pBdr>
           <w:bottom w:val="single" w:color="2B7A78" w:sz="8" w:space="3"/>
         </w:pBdr>
-        <w:spacing w:after="60" w:before="130"/>
+        <w:spacing w:after="50" w:before="110"/>
       </w:pPr>
       <w:r>
         <w:rPr>
@@ -1123,7 +1159,7 @@
           <w:sz w:val="20"/>
           <w:szCs w:val="20"/>
         </w:rPr>
-        <w:t xml:space="preserve">Devo SIEM · Devo SOAR (LogicHub) · SOAR playbook design · SIEM monitoring · Access control design · Zoho Desk</w:t>
+        <w:t xml:space="preserve">Devo SIEM · Devo SOAR (LogicHub) · SOAR playbook design · SIEM monitoring · Access control &amp; RBAC · Arcon PAM</w:t>
       </w:r>
     </w:p>
     <w:p>
@@ -1148,7 +1184,7 @@
           <w:sz w:val="20"/>
           <w:szCs w:val="20"/>
         </w:rPr>
-        <w:t xml:space="preserve">Strike48 Prospector Studio · Claude · ChatGPT · Gemini · Grok · Meta AI · GitHub Copilot · MCP</w:t>
+        <w:t xml:space="preserve">Strike48 Prospector Studio · Claude · ChatGPT · Gemini · GitHub Copilot · MCP server integration</w:t>
       </w:r>
     </w:p>
     <w:p>
@@ -1211,10 +1247,6 @@
 </w:document>
 </file>
 
-<file path=word/comments.xml><?xml version="1.0" encoding="utf-8"?>
-<w:comments xmlns:cx="http://schemas.microsoft.com/office/drawing/2014/chartex" xmlns:cx1="http://schemas.microsoft.com/office/drawing/2015/9/8/chartex" xmlns:cx2="http://schemas.microsoft.com/office/drawing/2015/10/21/chartex" xmlns:cx3="http://schemas.microsoft.com/office/drawing/2016/5/9/chartex" xmlns:cx4="http://schemas.microsoft.com/office/drawing/2016/5/10/chartex" xmlns:cx5="http://schemas.microsoft.com/office/drawing/2016/5/11/chartex" xmlns:cx6="http://schemas.microsoft.com/office/drawing/2016/5/12/chartex" xmlns:cx7="http://schemas.microsoft.com/office/drawing/2016/5/13/chartex" xmlns:cx8="http://schemas.microsoft.com/office/drawing/2016/5/14/chartex" xmlns:mc="http://schemas.openxmlformats.org/markup-compatibility/2006" xmlns:aink="http://schemas.microsoft.com/office/drawing/2016/ink" xmlns:am3d="http://schemas.microsoft.com/office/drawing/2017/model3d" xmlns:o="urn:schemas-microsoft-com:office:office" xmlns:r="http://schemas.openxmlformats.org/officeDocument/2006/relationships" xmlns:m="http://schemas.openxmlformats.org/officeDocument/2006/math" xmlns:v="urn:schemas-microsoft-com:vml" xmlns:wp14="http://schemas.microsoft.com/office/word/2010/wordprocessingDrawing" xmlns:wp="http://schemas.openxmlformats.org/drawingml/2006/wordprocessingDrawing" xmlns:w10="urn:schemas-microsoft-com:office:word" xmlns:w="http://schemas.openxmlformats.org/wordprocessingml/2006/main" xmlns:w14="http://schemas.microsoft.com/office/word/2010/wordml" xmlns:w15="http://schemas.microsoft.com/office/word/2012/wordml" xmlns:w16cex="http://schemas.microsoft.com/office/word/2018/wordml/cex" xmlns:w16cid="http://schemas.microsoft.com/office/word/2016/wordml/cid" xmlns:w16="http://schemas.microsoft.com/office/word/2018/wordml" xmlns:w16sdtdh="http://schemas.microsoft.com/office/word/2020/wordml/sdtdatahash" xmlns:w16se="http://schemas.microsoft.com/office/word/2015/wordml/symex" xmlns:wpg="http://schemas.microsoft.com/office/word/2010/wordprocessingGroup" xmlns:wpi="http://schemas.microsoft.com/office/word/2010/wordprocessingInk" xmlns:wne="http://schemas.microsoft.com/office/word/2006/wordml" xmlns:wps="http://schemas.microsoft.com/office/word/2010/wordprocessingShape"/>
-</file>
-
 <file path=word/endnotes.xml><?xml version="1.0" encoding="utf-8"?>
 <w:endnotes xmlns:wpc="http://schemas.microsoft.com/office/word/2010/wordprocessingCanvas" xmlns:mc="http://schemas.openxmlformats.org/markup-compatibility/2006" xmlns:o="urn:schemas-microsoft-com:office:office" xmlns:r="http://schemas.openxmlformats.org/officeDocument/2006/relationships" xmlns:m="http://schemas.openxmlformats.org/officeDocument/2006/math" xmlns:v="urn:schemas-microsoft-com:vml" xmlns:wp14="http://schemas.microsoft.com/office/word/2010/wordprocessingDrawing" xmlns:wp="http://schemas.openxmlformats.org/drawingml/2006/wordprocessingDrawing" xmlns:w10="urn:schemas-microsoft-com:office:word" xmlns:w="http://schemas.openxmlformats.org/wordprocessingml/2006/main" xmlns:w14="http://schemas.microsoft.com/office/word/2010/wordml" xmlns:w15="http://schemas.microsoft.com/office/word/2012/wordml" xmlns:wpg="http://schemas.microsoft.com/office/word/2010/wordprocessingGroup" xmlns:wpi="http://schemas.microsoft.com/office/word/2010/wordprocessingInk" xmlns:wne="http://schemas.microsoft.com/office/word/2006/wordml" xmlns:wps="http://schemas.microsoft.com/office/word/2010/wordprocessingShape" mc:Ignorable="w14 w15 wp14">
   <w:endnote w:type="separator" w:id="-1">
@@ -1293,7 +1325,7 @@
 <w:numbering xmlns:wpc="http://schemas.microsoft.com/office/word/2010/wordprocessingCanvas" xmlns:mc="http://schemas.openxmlformats.org/markup-compatibility/2006" xmlns:o="urn:schemas-microsoft-com:office:office" xmlns:r="http://schemas.openxmlformats.org/officeDocument/2006/relationships" xmlns:m="http://schemas.openxmlformats.org/officeDocument/2006/math" xmlns:v="urn:schemas-microsoft-com:vml" xmlns:wp14="http://schemas.microsoft.com/office/word/2010/wordprocessingDrawing" xmlns:wp="http://schemas.openxmlformats.org/drawingml/2006/wordprocessingDrawing" xmlns:w10="urn:schemas-microsoft-com:office:word" xmlns:w="http://schemas.openxmlformats.org/wordprocessingml/2006/main" xmlns:w14="http://schemas.microsoft.com/office/word/2010/wordml" xmlns:w15="http://schemas.microsoft.com/office/word/2012/wordml" xmlns:wpg="http://schemas.microsoft.com/office/word/2010/wordprocessingGroup" xmlns:wpi="http://schemas.microsoft.com/office/word/2010/wordprocessingInk" xmlns:wne="http://schemas.microsoft.com/office/word/2006/wordml" xmlns:wps="http://schemas.microsoft.com/office/word/2010/wordprocessingShape" mc:Ignorable="w14 w15 wp14">
   <w:abstractNum w:abstractNumId="1" w15:restartNumberingAfterBreak="0">
     <w:multiLevelType w:val="hybridMultilevel"/>
-    <w:lvl w:ilvl="0" w15:tentative="1">
+    <w:lvl w:ilvl="0" w:tentative="1">
       <w:start w:val="1"/>
       <w:numFmt w:val="bullet"/>
       <w:lvlText w:val="●"/>
@@ -1302,7 +1334,7 @@
         <w:ind w:left="720" w:hanging="360"/>
       </w:pPr>
     </w:lvl>
-    <w:lvl w:ilvl="1" w15:tentative="1">
+    <w:lvl w:ilvl="1" w:tentative="1">
       <w:start w:val="1"/>
       <w:numFmt w:val="bullet"/>
       <w:lvlText w:val="○"/>
@@ -1311,7 +1343,7 @@
         <w:ind w:left="1440" w:hanging="360"/>
       </w:pPr>
     </w:lvl>
-    <w:lvl w:ilvl="2" w15:tentative="1">
+    <w:lvl w:ilvl="2" w:tentative="1">
       <w:start w:val="1"/>
       <w:numFmt w:val="bullet"/>
       <w:lvlText w:val="■"/>
@@ -1320,7 +1352,7 @@
         <w:ind w:left="2160" w:hanging="360"/>
       </w:pPr>
     </w:lvl>
-    <w:lvl w:ilvl="3" w15:tentative="1">
+    <w:lvl w:ilvl="3" w:tentative="1">
       <w:start w:val="1"/>
       <w:numFmt w:val="bullet"/>
       <w:lvlText w:val="●"/>
@@ -1329,7 +1361,7 @@
         <w:ind w:left="2880" w:hanging="360"/>
       </w:pPr>
     </w:lvl>
-    <w:lvl w:ilvl="4" w15:tentative="1">
+    <w:lvl w:ilvl="4" w:tentative="1">
       <w:start w:val="1"/>
       <w:numFmt w:val="bullet"/>
       <w:lvlText w:val="○"/>
@@ -1338,7 +1370,7 @@
         <w:ind w:left="3600" w:hanging="360"/>
       </w:pPr>
     </w:lvl>
-    <w:lvl w:ilvl="5" w15:tentative="1">
+    <w:lvl w:ilvl="5" w:tentative="1">
       <w:start w:val="1"/>
       <w:numFmt w:val="bullet"/>
       <w:lvlText w:val="■"/>
@@ -1347,7 +1379,7 @@
         <w:ind w:left="4320" w:hanging="360"/>
       </w:pPr>
     </w:lvl>
-    <w:lvl w:ilvl="6" w15:tentative="1">
+    <w:lvl w:ilvl="6" w:tentative="1">
       <w:start w:val="1"/>
       <w:numFmt w:val="bullet"/>
       <w:lvlText w:val="●"/>
@@ -1356,7 +1388,7 @@
         <w:ind w:left="5040" w:hanging="360"/>
       </w:pPr>
     </w:lvl>
-    <w:lvl w:ilvl="7" w15:tentative="1">
+    <w:lvl w:ilvl="7" w:tentative="1">
       <w:start w:val="1"/>
       <w:numFmt w:val="bullet"/>
       <w:lvlText w:val="●"/>
@@ -1365,7 +1397,7 @@
         <w:ind w:left="5760" w:hanging="360"/>
       </w:pPr>
     </w:lvl>
-    <w:lvl w:ilvl="8" w15:tentative="1">
+    <w:lvl w:ilvl="8" w:tentative="1">
       <w:start w:val="1"/>
       <w:numFmt w:val="bullet"/>
       <w:lvlText w:val="●"/>
@@ -1377,7 +1409,7 @@
   </w:abstractNum>
   <w:abstractNum w:abstractNumId="2" w15:restartNumberingAfterBreak="0">
     <w:multiLevelType w:val="hybridMultilevel"/>
-    <w:lvl w:ilvl="0" w15:tentative="1">
+    <w:lvl w:ilvl="0" w:tentative="1">
       <w:start w:val="1"/>
       <w:numFmt w:val="bullet"/>
       <w:lvlText w:val="▸"/>
@@ -1421,6 +1453,10 @@
     </w:rPrDefault>
     <w:pPrDefault/>
   </w:docDefaults>
+  <w:style w:type="paragraph" w:styleId="Normal" w:default="1">
+    <w:name w:val="Normal"/>
+    <w:qFormat/>
+  </w:style>
   <w:style w:type="paragraph" w:styleId="Title">
     <w:name w:val="Title"/>
     <w:basedOn w:val="Normal"/>
@@ -1593,4 +1629,294 @@
     </w:rPr>
   </w:style>
 </w:styles>
+</file>
+
+<file path=word/theme/theme1.xml><?xml version="1.0" encoding="utf-8"?>
+<a:theme xmlns:a="http://schemas.openxmlformats.org/drawingml/2006/main" name="Office Theme">
+  <a:themeElements>
+    <a:clrScheme name="Office">
+      <a:dk1>
+        <a:sysClr val="windowText" lastClr="000000"/>
+      </a:dk1>
+      <a:lt1>
+        <a:sysClr val="window" lastClr="FFFFFF"/>
+      </a:lt1>
+      <a:dk2>
+        <a:srgbClr val="44546A"/>
+      </a:dk2>
+      <a:lt2>
+        <a:srgbClr val="E7E6E6"/>
+      </a:lt2>
+      <a:accent1>
+        <a:srgbClr val="4472C4"/>
+      </a:accent1>
+      <a:accent2>
+        <a:srgbClr val="ED7D31"/>
+      </a:accent2>
+      <a:accent3>
+        <a:srgbClr val="A5A5A5"/>
+      </a:accent3>
+      <a:accent4>
+        <a:srgbClr val="FFC000"/>
+      </a:accent4>
+      <a:accent5>
+        <a:srgbClr val="5B9BD5"/>
+      </a:accent5>
+      <a:accent6>
+        <a:srgbClr val="70AD47"/>
+      </a:accent6>
+      <a:hlink>
+        <a:srgbClr val="0563C1"/>
+      </a:hlink>
+      <a:folHlink>
+        <a:srgbClr val="954F72"/>
+      </a:folHlink>
+    </a:clrScheme>
+    <a:fontScheme name="Office">
+      <a:majorFont>
+        <a:latin typeface="Calibri Light" panose="020F0302020204030204"/>
+        <a:ea typeface=""/>
+        <a:cs typeface=""/>
+        <a:font script="Jpan" typeface="游ゴシック Light"/>
+        <a:font script="Hang" typeface="맑은 고딕"/>
+        <a:font script="Hans" typeface="等线 Light"/>
+        <a:font script="Hant" typeface="新細明體"/>
+        <a:font script="Arab" typeface="Times New Roman"/>
+        <a:font script="Hebr" typeface="Times New Roman"/>
+        <a:font script="Thai" typeface="Angsana New"/>
+        <a:font script="Ethi" typeface="Nyala"/>
+        <a:font script="Beng" typeface="Vrinda"/>
+        <a:font script="Gujr" typeface="Shruti"/>
+        <a:font script="Khmr" typeface="MoolBoran"/>
+        <a:font script="Knda" typeface="Tunga"/>
+        <a:font script="Guru" typeface="Raavi"/>
+        <a:font script="Cans" typeface="Euphemia"/>
+        <a:font script="Cher" typeface="Plantagenet Cherokee"/>
+        <a:font script="Yiii" typeface="Microsoft Yi Baiti"/>
+        <a:font script="Tibt" typeface="Microsoft Himalaya"/>
+        <a:font script="Thaa" typeface="MV Boli"/>
+        <a:font script="Deva" typeface="Mangal"/>
+        <a:font script="Telu" typeface="Gautami"/>
+        <a:font script="Taml" typeface="Latha"/>
+        <a:font script="Syrc" typeface="Estrangelo Edessa"/>
+        <a:font script="Orya" typeface="Kalinga"/>
+        <a:font script="Mlym" typeface="Kartika"/>
+        <a:font script="Laoo" typeface="DokChampa"/>
+        <a:font script="Sinh" typeface="Iskoola Pota"/>
+        <a:font script="Mong" typeface="Mongolian Baiti"/>
+        <a:font script="Viet" typeface="Times New Roman"/>
+        <a:font script="Uigh" typeface="Microsoft Uighur"/>
+        <a:font script="Geor" typeface="Sylfaen"/>
+        <a:font script="Armn" typeface="Arial"/>
+        <a:font script="Bugi" typeface="Leelawadee UI"/>
+        <a:font script="Bopo" typeface="Microsoft JhengHei"/>
+        <a:font script="Java" typeface="Javanese Text"/>
+        <a:font script="Lisu" typeface="Segoe UI"/>
+        <a:font script="Mymr" typeface="Myanmar Text"/>
+        <a:font script="Nkoo" typeface="Ebrima"/>
+        <a:font script="Olck" typeface="Nirmala UI"/>
+        <a:font script="Osma" typeface="Ebrima"/>
+        <a:font script="Phag" typeface="Phagspa"/>
+        <a:font script="Syrn" typeface="Estrangelo Edessa"/>
+        <a:font script="Syrj" typeface="Estrangelo Edessa"/>
+        <a:font script="Syre" typeface="Estrangelo Edessa"/>
+        <a:font script="Sora" typeface="Nirmala UI"/>
+        <a:font script="Tale" typeface="Microsoft Tai Le"/>
+        <a:font script="Talu" typeface="Microsoft New Tai Lue"/>
+        <a:font script="Tfng" typeface="Ebrima"/>
+      </a:majorFont>
+      <a:minorFont>
+        <a:latin typeface="Calibri" panose="020F0502020204030204"/>
+        <a:ea typeface=""/>
+        <a:cs typeface=""/>
+        <a:font script="Jpan" typeface="游明朝"/>
+        <a:font script="Hang" typeface="맑은 고딕"/>
+        <a:font script="Hans" typeface="等线"/>
+        <a:font script="Hant" typeface="新細明體"/>
+        <a:font script="Arab" typeface="Arial"/>
+        <a:font script="Hebr" typeface="Arial"/>
+        <a:font script="Thai" typeface="Cordia New"/>
+        <a:font script="Ethi" typeface="Nyala"/>
+        <a:font script="Beng" typeface="Vrinda"/>
+        <a:font script="Gujr" typeface="Shruti"/>
+        <a:font script="Khmr" typeface="DaunPenh"/>
+        <a:font script="Knda" typeface="Tunga"/>
+        <a:font script="Guru" typeface="Raavi"/>
+        <a:font script="Cans" typeface="Euphemia"/>
+        <a:font script="Cher" typeface="Plantagenet Cherokee"/>
+        <a:font script="Yiii" typeface="Microsoft Yi Baiti"/>
+        <a:font script="Tibt" typeface="Microsoft Himalaya"/>
+        <a:font script="Thaa" typeface="MV Boli"/>
+        <a:font script="Deva" typeface="Mangal"/>
+        <a:font script="Telu" typeface="Gautami"/>
+        <a:font script="Taml" typeface="Latha"/>
+        <a:font script="Syrc" typeface="Estrangelo Edessa"/>
+        <a:font script="Orya" typeface="Kalinga"/>
+        <a:font script="Mlym" typeface="Kartika"/>
+        <a:font script="Laoo" typeface="DokChampa"/>
+        <a:font script="Sinh" typeface="Iskoola Pota"/>
+        <a:font script="Mong" typeface="Mongolian Baiti"/>
+        <a:font script="Viet" typeface="Arial"/>
+        <a:font script="Uigh" typeface="Microsoft Uighur"/>
+        <a:font script="Geor" typeface="Sylfaen"/>
+        <a:font script="Armn" typeface="Arial"/>
+        <a:font script="Bugi" typeface="Leelawadee UI"/>
+        <a:font script="Bopo" typeface="Microsoft JhengHei"/>
+        <a:font script="Java" typeface="Javanese Text"/>
+        <a:font script="Lisu" typeface="Segoe UI"/>
+        <a:font script="Mymr" typeface="Myanmar Text"/>
+        <a:font script="Nkoo" typeface="Ebrima"/>
+        <a:font script="Olck" typeface="Nirmala UI"/>
+        <a:font script="Osma" typeface="Ebrima"/>
+        <a:font script="Phag" typeface="Phagspa"/>
+        <a:font script="Syrn" typeface="Estrangelo Edessa"/>
+        <a:font script="Syrj" typeface="Estrangelo Edessa"/>
+        <a:font script="Syre" typeface="Estrangelo Edessa"/>
+        <a:font script="Sora" typeface="Nirmala UI"/>
+        <a:font script="Tale" typeface="Microsoft Tai Le"/>
+        <a:font script="Talu" typeface="Microsoft New Tai Lue"/>
+        <a:font script="Tfng" typeface="Ebrima"/>
+      </a:minorFont>
+    </a:fontScheme>
+    <a:fmtScheme name="Office">
+      <a:fillStyleLst>
+        <a:solidFill>
+          <a:schemeClr val="phClr"/>
+        </a:solidFill>
+        <a:gradFill rotWithShape="true">
+          <a:gsLst>
+            <a:gs pos="0">
+              <a:schemeClr val="phClr">
+                <a:lumMod val="110000"/>
+                <a:satMod val="105000"/>
+                <a:tint val="67000"/>
+              </a:schemeClr>
+            </a:gs>
+            <a:gs pos="50000">
+              <a:schemeClr val="phClr">
+                <a:lumMod val="105000"/>
+                <a:satMod val="103000"/>
+                <a:tint val="73000"/>
+              </a:schemeClr>
+            </a:gs>
+            <a:gs pos="100000">
+              <a:schemeClr val="phClr">
+                <a:lumMod val="105000"/>
+                <a:satMod val="109000"/>
+                <a:tint val="81000"/>
+              </a:schemeClr>
+            </a:gs>
+          </a:gsLst>
+          <a:lin ang="5400000" scaled="false"/>
+        </a:gradFill>
+        <a:gradFill rotWithShape="true">
+          <a:gsLst>
+            <a:gs pos="0">
+              <a:schemeClr val="phClr">
+                <a:satMod val="103000"/>
+                <a:lumMod val="102000"/>
+                <a:tint val="94000"/>
+              </a:schemeClr>
+            </a:gs>
+            <a:gs pos="50000">
+              <a:schemeClr val="phClr">
+                <a:satMod val="110000"/>
+                <a:lumMod val="100000"/>
+                <a:shade val="100000"/>
+              </a:schemeClr>
+            </a:gs>
+            <a:gs pos="100000">
+              <a:schemeClr val="phClr">
+                <a:lumMod val="99000"/>
+                <a:satMod val="120000"/>
+                <a:shade val="78000"/>
+              </a:schemeClr>
+            </a:gs>
+          </a:gsLst>
+          <a:lin ang="5400000" scaled="false"/>
+        </a:gradFill>
+      </a:fillStyleLst>
+      <a:lnStyleLst>
+        <a:ln w="6350" cap="flat" cmpd="sng" algn="ctr">
+          <a:solidFill>
+            <a:schemeClr val="phClr"/>
+          </a:solidFill>
+          <a:prstDash val="solid"/>
+          <a:miter lim="800000"/>
+        </a:ln>
+        <a:ln w="12700" cap="flat" cmpd="sng" algn="ctr">
+          <a:solidFill>
+            <a:schemeClr val="phClr"/>
+          </a:solidFill>
+          <a:prstDash val="solid"/>
+          <a:miter lim="800000"/>
+        </a:ln>
+        <a:ln w="19050" cap="flat" cmpd="sng" algn="ctr">
+          <a:solidFill>
+            <a:schemeClr val="phClr"/>
+          </a:solidFill>
+          <a:prstDash val="solid"/>
+          <a:miter lim="800000"/>
+        </a:ln>
+      </a:lnStyleLst>
+      <a:effectStyleLst>
+        <a:effectStyle>
+          <a:effectLst/>
+        </a:effectStyle>
+        <a:effectStyle>
+          <a:effectLst/>
+        </a:effectStyle>
+        <a:effectStyle>
+          <a:effectLst>
+            <a:outerShdw blurRad="57150" dist="19050" dir="5400000" algn="ctr" rotWithShape="false">
+              <a:srgbClr val="000000">
+                <a:alpha val="63000"/>
+              </a:srgbClr>
+            </a:outerShdw>
+          </a:effectLst>
+        </a:effectStyle>
+      </a:effectStyleLst>
+      <a:bgFillStyleLst>
+        <a:solidFill>
+          <a:schemeClr val="phClr"/>
+        </a:solidFill>
+        <a:solidFill>
+          <a:schemeClr val="phClr">
+            <a:tint val="95000"/>
+            <a:satMod val="170000"/>
+          </a:schemeClr>
+        </a:solidFill>
+        <a:gradFill rotWithShape="true">
+          <a:gsLst>
+            <a:gs pos="0">
+              <a:schemeClr val="phClr">
+                <a:tint val="93000"/>
+                <a:satMod val="150000"/>
+                <a:shade val="98000"/>
+                <a:lumMod val="102000"/>
+              </a:schemeClr>
+            </a:gs>
+            <a:gs pos="50000">
+              <a:schemeClr val="phClr">
+                <a:tint val="98000"/>
+                <a:satMod val="130000"/>
+                <a:shade val="90000"/>
+                <a:lumMod val="103000"/>
+              </a:schemeClr>
+            </a:gs>
+            <a:gs pos="100000">
+              <a:schemeClr val="phClr">
+                <a:shade val="63000"/>
+                <a:satMod val="120000"/>
+              </a:schemeClr>
+            </a:gs>
+          </a:gsLst>
+          <a:lin ang="5400000" scaled="false"/>
+        </a:gradFill>
+      </a:bgFillStyleLst>
+    </a:fmtScheme>
+  </a:themeElements>
+  <a:objectDefaults/>
+  <a:extraClrSchemeLst/>
+</a:theme>
 </file>
</xml_diff>